<commit_message>
Added complete final red teaming report
</commit_message>
<xml_diff>
--- a/week 3/Final Report 3.docx
+++ b/week 3/Final Report 3.docx
@@ -19,8 +19,18 @@
         <w:spacing w:before="0" w:after="283"/>
         <w:rPr/>
       </w:pPr>
-      <w:r>
-        <w:rPr/>
+      <w:hyperlink r:id="rId2">
+        <w:r>
+          <w:rPr>
+            <w:rStyle w:val="Hyperlink"/>
+            <w:color w:val="8E86AE"/>
+          </w:rPr>
+          <w:t>github Link</w:t>
+        </w:r>
+      </w:hyperlink>
+      <w:r>
+        <w:rPr/>
+        <w:t xml:space="preserve"> : https://github.com/SidVela/cyart-red-teaming-3rd-week</w:t>
       </w:r>
     </w:p>
     <w:p>
@@ -1478,6 +1488,16 @@
         </w:tc>
       </w:tr>
     </w:tbl>
+    <w:p>
+      <w:pPr>
+        <w:pStyle w:val="Heading2"/>
+        <w:spacing w:before="0" w:after="283"/>
+        <w:rPr/>
+      </w:pPr>
+      <w:r>
+        <w:rPr/>
+      </w:r>
+    </w:p>
     <w:p>
       <w:pPr>
         <w:pStyle w:val="Heading2"/>
@@ -4050,7 +4070,7 @@
                     </pic:cNvPicPr>
                   </pic:nvPicPr>
                   <pic:blipFill>
-                    <a:blip r:embed="rId2"/>
+                    <a:blip r:embed="rId3"/>
                     <a:stretch>
                       <a:fillRect/>
                     </a:stretch>
@@ -4241,7 +4261,7 @@
                     </pic:cNvPicPr>
                   </pic:nvPicPr>
                   <pic:blipFill>
-                    <a:blip r:embed="rId3"/>
+                    <a:blip r:embed="rId4"/>
                     <a:stretch>
                       <a:fillRect/>
                     </a:stretch>
@@ -4560,7 +4580,7 @@
                     </pic:cNvPicPr>
                   </pic:nvPicPr>
                   <pic:blipFill>
-                    <a:blip r:embed="rId4"/>
+                    <a:blip r:embed="rId5"/>
                     <a:stretch>
                       <a:fillRect/>
                     </a:stretch>
@@ -4676,7 +4696,7 @@
                     </pic:cNvPicPr>
                   </pic:nvPicPr>
                   <pic:blipFill>
-                    <a:blip r:embed="rId5"/>
+                    <a:blip r:embed="rId6"/>
                     <a:stretch>
                       <a:fillRect/>
                     </a:stretch>
@@ -4801,7 +4821,7 @@
                     </pic:cNvPicPr>
                   </pic:nvPicPr>
                   <pic:blipFill>
-                    <a:blip r:embed="rId6"/>
+                    <a:blip r:embed="rId7"/>
                     <a:stretch>
                       <a:fillRect/>
                     </a:stretch>
@@ -4948,7 +4968,7 @@
                     </pic:cNvPicPr>
                   </pic:nvPicPr>
                   <pic:blipFill>
-                    <a:blip r:embed="rId7"/>
+                    <a:blip r:embed="rId8"/>
                     <a:stretch>
                       <a:fillRect/>
                     </a:stretch>
@@ -5359,7 +5379,7 @@
                     </pic:cNvPicPr>
                   </pic:nvPicPr>
                   <pic:blipFill>
-                    <a:blip r:embed="rId8"/>
+                    <a:blip r:embed="rId9"/>
                     <a:stretch>
                       <a:fillRect/>
                     </a:stretch>
@@ -5700,7 +5720,7 @@
                     </pic:cNvPicPr>
                   </pic:nvPicPr>
                   <pic:blipFill>
-                    <a:blip r:embed="rId9"/>
+                    <a:blip r:embed="rId10"/>
                     <a:stretch>
                       <a:fillRect/>
                     </a:stretch>
@@ -5791,7 +5811,7 @@
                     </pic:cNvPicPr>
                   </pic:nvPicPr>
                   <pic:blipFill>
-                    <a:blip r:embed="rId10"/>
+                    <a:blip r:embed="rId11"/>
                     <a:stretch>
                       <a:fillRect/>
                     </a:stretch>
@@ -5929,7 +5949,7 @@
                     </pic:cNvPicPr>
                   </pic:nvPicPr>
                   <pic:blipFill>
-                    <a:blip r:embed="rId11"/>
+                    <a:blip r:embed="rId12"/>
                     <a:stretch>
                       <a:fillRect/>
                     </a:stretch>
@@ -6059,7 +6079,7 @@
                     </pic:cNvPicPr>
                   </pic:nvPicPr>
                   <pic:blipFill>
-                    <a:blip r:embed="rId12"/>
+                    <a:blip r:embed="rId13"/>
                     <a:stretch>
                       <a:fillRect/>
                     </a:stretch>
@@ -6662,7 +6682,7 @@
                     </pic:cNvPicPr>
                   </pic:nvPicPr>
                   <pic:blipFill>
-                    <a:blip r:embed="rId13"/>
+                    <a:blip r:embed="rId14"/>
                     <a:stretch>
                       <a:fillRect/>
                     </a:stretch>
@@ -6708,7 +6728,7 @@
                     </pic:cNvPicPr>
                   </pic:nvPicPr>
                   <pic:blipFill>
-                    <a:blip r:embed="rId14"/>
+                    <a:blip r:embed="rId15"/>
                     <a:stretch>
                       <a:fillRect/>
                     </a:stretch>
@@ -6823,7 +6843,7 @@
                     </pic:cNvPicPr>
                   </pic:nvPicPr>
                   <pic:blipFill>
-                    <a:blip r:embed="rId15"/>
+                    <a:blip r:embed="rId16"/>
                     <a:stretch>
                       <a:fillRect/>
                     </a:stretch>
@@ -6869,7 +6889,7 @@
                     </pic:cNvPicPr>
                   </pic:nvPicPr>
                   <pic:blipFill>
-                    <a:blip r:embed="rId16"/>
+                    <a:blip r:embed="rId17"/>
                     <a:stretch>
                       <a:fillRect/>
                     </a:stretch>
@@ -6974,7 +6994,7 @@
                     </pic:cNvPicPr>
                   </pic:nvPicPr>
                   <pic:blipFill>
-                    <a:blip r:embed="rId17"/>
+                    <a:blip r:embed="rId18"/>
                     <a:stretch>
                       <a:fillRect/>
                     </a:stretch>
@@ -7100,7 +7120,7 @@
                     </pic:cNvPicPr>
                   </pic:nvPicPr>
                   <pic:blipFill>
-                    <a:blip r:embed="rId18"/>
+                    <a:blip r:embed="rId19"/>
                     <a:stretch>
                       <a:fillRect/>
                     </a:stretch>
@@ -7123,12 +7143,12 @@
       </w:r>
     </w:p>
     <w:sectPr>
-      <w:headerReference w:type="even" r:id="rId19"/>
-      <w:headerReference w:type="default" r:id="rId20"/>
-      <w:headerReference w:type="first" r:id="rId21"/>
-      <w:footerReference w:type="even" r:id="rId22"/>
-      <w:footerReference w:type="default" r:id="rId23"/>
-      <w:footerReference w:type="first" r:id="rId24"/>
+      <w:headerReference w:type="even" r:id="rId20"/>
+      <w:headerReference w:type="default" r:id="rId21"/>
+      <w:headerReference w:type="first" r:id="rId22"/>
+      <w:footerReference w:type="even" r:id="rId23"/>
+      <w:footerReference w:type="default" r:id="rId24"/>
+      <w:footerReference w:type="first" r:id="rId25"/>
       <w:type w:val="nextPage"/>
       <w:pgSz w:w="11906" w:h="16838"/>
       <w:pgMar w:left="1440" w:right="1440" w:gutter="0" w:header="576" w:top="1440" w:footer="432" w:bottom="1440"/>
@@ -11221,6 +11241,13 @@
     <w:qFormat/>
     <w:rPr/>
   </w:style>
+  <w:style w:type="character" w:styleId="Hyperlink">
+    <w:name w:val="Hyperlink"/>
+    <w:rPr>
+      <w:color w:val="000080"/>
+      <w:u w:val="single"/>
+    </w:rPr>
+  </w:style>
   <w:style w:type="paragraph" w:styleId="Heading">
     <w:name w:val="Heading"/>
     <w:basedOn w:val="Normal"/>

</xml_diff>